<commit_message>
Fix script paths, DOCX output location, and quiz event listener bug
- Update daneasso2.py to output JSON relative to script directory.
- Update genrozklad.js to save output DOCX into docs/pliki/rozklad-materialu-asso-3tt.docx instead of hardcoded home path.
- Prevent duplicate event listener attachment in docs/assets/js/quiz.js upon quiz reset.
- Update .gitignore to exclude temporary artifacts.

Co-authored-by: JosiMate <323826209+JosiMate@users.noreply.github.com>
</commit_message>
<xml_diff>
--- a/docs/pliki/rozklad-materialu-asso-3tt.docx
+++ b/docs/pliki/rozklad-materialu-asso-3tt.docx
@@ -61,7 +61,7 @@
           <w:sz w:val="22"/>
           <w:szCs w:val="22"/>
         </w:rPr>
-        <w:t xml:space="preserve">klasa 3TT · technik informatyk (351203) · kwalifikacja INF.02</w:t>
+        <w:t xml:space="preserve">klasa 3TT · technik teleinformatyk (351103) · kwalifikacja INF.07</w:t>
       </w:r>
     </w:p>
     <w:p>
@@ -79,7 +79,7 @@
           <w:sz w:val="20"/>
           <w:szCs w:val="20"/>
         </w:rPr>
-        <w:t xml:space="preserve">2 godziny tygodniowo · 60 godzin w roku szkolnym · 10 działów, 52 tematy</w:t>
+        <w:t xml:space="preserve">2 godziny tygodniowo · 60 godzin w roku szkolnym · 11 działów, 53 tematy</w:t>
       </w:r>
     </w:p>
     <w:p>
@@ -109,7 +109,7 @@
           <w:sz w:val="21"/>
           <w:szCs w:val="21"/>
         </w:rPr>
-        <w:t xml:space="preserve">Windows Server uczniowie realizowali w klasie drugiej, więc ten rok szkolny jest rokiem Linuksa. Na administrowanie serwerem Linux — instalację, konfigurację sieciową, usługi, bezpieczeństwo i utrzymanie — przeznaczono 51 z 60 godzin.</w:t>
+        <w:t xml:space="preserve">Przedmiot realizuje jednostkę efektów kształcenia INF.07.5 „Administrowanie sieciowymi systemami operacyjnymi” z kwalifikacji INF.07 „Montaż i konfiguracja lokalnych sieci komputerowych oraz administrowanie systemami operacyjnymi”, uzupełniająco INF.07.1 „Bezpieczeństwo i higiena pracy”. Wszystkie osiem efektów jednostki INF.07.5 ma pokrycie w rozkładzie.</w:t>
       </w:r>
     </w:p>
     <w:p>
@@ -122,7 +122,7 @@
           <w:sz w:val="21"/>
           <w:szCs w:val="21"/>
         </w:rPr>
-        <w:t xml:space="preserve">Materiał windowsowy pojawia się w dwóch miejscach i łącznie zajmuje 9 godzin: jako powtórzenie ról i usług serwera na pierwszej lekcji (dział I) oraz jako zestawienie odpowiedników usług i praca serwera Linux w sieci ze stacjami Windows (dział VIII). Nie jest to ponowne przerabianie materiału klasy drugiej: efekt INF.02.8.2 wymaga rozróżniania usług i funkcji różnych sieciowych systemów operacyjnych, a zadania egzaminacyjne bywają stawiane w obu rodzinach, więc porównanie jest potrzebne i jest wprost celem działu VIII.</w:t>
+        <w:t xml:space="preserve">Windows Server uczniowie realizowali w klasie drugiej, więc ten rok szkolny jest rokiem Linuksa. Na wdrożenie serwera Linux, jego konfigurację sieciową, usługi, zabezpieczenia i utrzymanie przeznaczono 55 z 60 godzin.</w:t>
       </w:r>
     </w:p>
     <w:p>
@@ -135,7 +135,7 @@
           <w:sz w:val="21"/>
           <w:szCs w:val="21"/>
         </w:rPr>
-        <w:t xml:space="preserve">Materiał podzielono na dziesięć działów. Kolejność odpowiada kolejności czynności administratora: system (instalacja, konta, uprawnienia, dyski), sieć (adresacja i diagnostyka), usługi adresowania i nazw, udostępnianie zasobów, usługi internetowe, bezpieczeństwo i dostęp zdalny, współpraca z klientami Windows, wreszcie utrzymanie i przygotowanie do egzaminu.</w:t>
+        <w:t xml:space="preserve">Materiał windowsowy zajmuje 5 godzin: godzinę powtórzeniową o zadaniach i usługach sieciowych systemów operacyjnych (dział I) oraz dział X — zestawienie odpowiedników usług, przyłączanie stacji roboczej do domeny i publikowanie zasobów przez usługi katalogowe. Nie jest to powtarzanie materiału klasy drugiej: efekt INF.07.5.1 wymaga rozróżniania sieciowych systemów operacyjnych z rodziny Windows i Linux, a kryterium weryfikacji efektu INF.07.5.5 wprost mówi o przyłączaniu stacji roboczej do domeny.</w:t>
       </w:r>
     </w:p>
     <w:p>
@@ -148,7 +148,7 @@
           <w:sz w:val="21"/>
           <w:szCs w:val="21"/>
         </w:rPr>
-        <w:t xml:space="preserve">Wewnątrz działu tematy idą od instalacji roli, przez konfigurację, po sprawdzenie działania z poziomu klienta. Zarządzanie dyskami poprzedza serwer plików, usługa DNS poprzedza publikację witryny pod nazwą, a konfiguracja sieciowa poprzedza wszystkie usługi sieciowe — bez tego kolejne tematy wisiałyby w próżni.</w:t>
+        <w:t xml:space="preserve">Materiał podzielono na jedenaście działów. Kolejność odpowiada kolejności czynności administratora: wdrożenie systemu i zarządzanie kontami, konfiguracja sieciowa, wdrażanie ról i usług, udostępnianie zasobów, usługi internetowe, zdalna administracja i monitorowanie, zabezpieczenia, kopie bezpieczeństwa i usuwanie awarii, wreszcie współpraca obu rodzin systemów i przygotowanie do egzaminu.</w:t>
       </w:r>
     </w:p>
     <w:p>
@@ -161,7 +161,7 @@
           <w:sz w:val="21"/>
           <w:szCs w:val="21"/>
         </w:rPr>
-        <w:t xml:space="preserve">Trzy praktyczne sprawdziany zamykają kolejno: instalację serwera wraz z kontami, uprawnieniami i adresacją (dział III), usługi sieciowe serwera Linux (dział V) oraz usługi internetowe, bezpieczeństwo i współpracę systemów (dział VIII). Ostatni dział to zadania egzaminacyjne rozwiązywane w warunkach zbliżonych do egzaminacyjnych.</w:t>
+        <w:t xml:space="preserve">Wewnątrz działu tematy idą od instalacji roli, przez konfigurację, po sprawdzenie działania z poziomu klienta. Zarządzanie dyskami poprzedza serwer plików, usługa DNS poprzedza publikację witryny pod nazwą, a konfiguracja sieciowa poprzedza wszystkie usługi sieciowe.</w:t>
       </w:r>
     </w:p>
     <w:p>
@@ -174,7 +174,7 @@
           <w:sz w:val="21"/>
           <w:szCs w:val="21"/>
         </w:rPr>
-        <w:t xml:space="preserve">Symbole w kolumnie „Efekty kształcenia” odsyłają do jednostki INF.02.8 „Administrowanie serwerowymi systemami operacyjnymi” podstawy programowej kształcenia w zawodzie technik informatyk oraz — przy pierwszym temacie — do jednostki INF.02.1 „Bezpieczeństwo i higiena pracy”.</w:t>
+        <w:t xml:space="preserve">Trzy praktyczne sprawdziany zamykają kolejno: wdrożenie serwera wraz z kontami, uprawnieniami i adresacją (dział III), usługi sieciowe i udostępnianie zasobów (dział V) oraz zabezpieczenia, kopie bezpieczeństwa i diagnostykę (dział IX). Ostatni dział to zadania egzaminacyjne rozwiązywane w warunkach zbliżonych do egzaminacyjnych.</w:t>
       </w:r>
     </w:p>
     <w:p>
@@ -207,7 +207,7 @@
           <w:sz w:val="20"/>
           <w:szCs w:val="20"/>
         </w:rPr>
-        <w:t xml:space="preserve">przeniesiono ciężar na system Linux: poprzednia wersja przeznaczała na Windows Server 33 z 60 godzin, powielając materiał klasy drugiej; obecnie jest to 9 godzin przeznaczonych na powtórzenie i na porównanie obu rodzin systemów;</w:t>
+        <w:t xml:space="preserve">przypisano rozkład do właściwej kwalifikacji: INF.07.5 dla zawodu technik teleinformatyk, a nie INF.02.8 dla technika informatyka — wszystkie odwołania do efektów i kryteriów weryfikacji zmieniono na numerację INF.07;</w:t>
       </w:r>
     </w:p>
     <w:p>
@@ -225,7 +225,79 @@
           <w:sz w:val="20"/>
           <w:szCs w:val="20"/>
         </w:rPr>
-        <w:t xml:space="preserve">część linuksową rozwinięto z 17 do 51 godzin — dopisano pracę w powłoce, konfigurację sieciową jako osobny dział, serwer WWW Apache, serwer FTP, serwer pocztowy, serwer aplikacji, SSH z logowaniem kluczem, utwardzanie serwera oraz kopie zapasowe;</w:t>
+        <w:t xml:space="preserve">przeniesiono ciężar na system Linux: poprzednia wersja przeznaczała na Windows Server 33 z 60 godzin, powielając materiał klasy drugiej; obecnie jest to 5 godzin na powtórzenie i na porównanie obu rodzin systemów;</w:t>
+      </w:r>
+    </w:p>
+    <w:p>
+      <w:pPr>
+        <w:pStyle w:val="ListParagraph"/>
+        <w:numPr>
+          <w:ilvl w:val="0"/>
+          <w:numId w:val="2"/>
+        </w:numPr>
+        <w:spacing w:after="40" w:line="252"/>
+      </w:pPr>
+      <w:r>
+        <w:rPr>
+          <w:rFonts w:ascii="Calibri" w:cs="Calibri" w:eastAsia="Calibri" w:hAnsi="Calibri"/>
+          <w:sz w:val="20"/>
+          <w:szCs w:val="20"/>
+        </w:rPr>
+        <w:t xml:space="preserve">część linuksową rozwinięto z 17 do 55 godzin — dopisano pracę w powłoce, konfigurację sieciową jako osobny dział, serwer WWW Apache, serwer FTP, serwer pocztowy, SSH z logowaniem kluczem oraz centralne zarządzanie stacjami roboczymi;</w:t>
+      </w:r>
+    </w:p>
+    <w:p>
+      <w:pPr>
+        <w:pStyle w:val="ListParagraph"/>
+        <w:numPr>
+          <w:ilvl w:val="0"/>
+          <w:numId w:val="2"/>
+        </w:numPr>
+        <w:spacing w:after="40" w:line="252"/>
+      </w:pPr>
+      <w:r>
+        <w:rPr>
+          <w:rFonts w:ascii="Calibri" w:cs="Calibri" w:eastAsia="Calibri" w:hAnsi="Calibri"/>
+          <w:sz w:val="20"/>
+          <w:szCs w:val="20"/>
+        </w:rPr>
+        <w:t xml:space="preserve">uzupełniono efekt INF.07.5.8, dotąd pokryty szczątkowo: dopisano metody ataków sieciowych, dobór i konfigurację oprogramowania zabezpieczającego, politykę haseł oraz fizyczne środki zabezpieczenia serwera (zasilacze awaryjne, macierze RAID);</w:t>
+      </w:r>
+    </w:p>
+    <w:p>
+      <w:pPr>
+        <w:pStyle w:val="ListParagraph"/>
+        <w:numPr>
+          <w:ilvl w:val="0"/>
+          <w:numId w:val="2"/>
+        </w:numPr>
+        <w:spacing w:after="40" w:line="252"/>
+      </w:pPr>
+      <w:r>
+        <w:rPr>
+          <w:rFonts w:ascii="Calibri" w:cs="Calibri" w:eastAsia="Calibri" w:hAnsi="Calibri"/>
+          <w:sz w:val="20"/>
+          <w:szCs w:val="20"/>
+        </w:rPr>
+        <w:t xml:space="preserve">uzupełniono efekt INF.07.5.7: dopisano monitorowanie pracy i wydajności serwera, zabezpieczanie danych przed usunięciem awarii, weryfikację poprawności działania systemu po naprawie oraz dokumentowanie spostrzeżeń, działań i wyników;</w:t>
+      </w:r>
+    </w:p>
+    <w:p>
+      <w:pPr>
+        <w:pStyle w:val="ListParagraph"/>
+        <w:numPr>
+          <w:ilvl w:val="0"/>
+          <w:numId w:val="2"/>
+        </w:numPr>
+        <w:spacing w:after="40" w:line="252"/>
+      </w:pPr>
+      <w:r>
+        <w:rPr>
+          <w:rFonts w:ascii="Calibri" w:cs="Calibri" w:eastAsia="Calibri" w:hAnsi="Calibri"/>
+          <w:sz w:val="20"/>
+          <w:szCs w:val="20"/>
+        </w:rPr>
+        <w:t xml:space="preserve">rozbudowano temat kopii bezpieczeństwa do dwóch lekcji — typy kopii i strategie ich tworzenia są w kryteriach weryfikacji wymienione osobno od samego wykonywania kopii;</w:t>
       </w:r>
     </w:p>
     <w:p>
@@ -279,25 +351,7 @@
           <w:sz w:val="20"/>
           <w:szCs w:val="20"/>
         </w:rPr>
-        <w:t xml:space="preserve">SAMBĘ i serwer plików rozdzielono na odrębne tematy i przeznaczono na nie po dwie godziny — to najczęstszy punkt styku obu rodzin systemów i typowy element zadania egzaminacyjnego;</w:t>
-      </w:r>
-    </w:p>
-    <w:p>
-      <w:pPr>
-        <w:pStyle w:val="ListParagraph"/>
-        <w:numPr>
-          <w:ilvl w:val="0"/>
-          <w:numId w:val="2"/>
-        </w:numPr>
-        <w:spacing w:after="40" w:line="252"/>
-      </w:pPr>
-      <w:r>
-        <w:rPr>
-          <w:rFonts w:ascii="Calibri" w:cs="Calibri" w:eastAsia="Calibri" w:hAnsi="Calibri"/>
-          <w:sz w:val="20"/>
-          <w:szCs w:val="20"/>
-        </w:rPr>
-        <w:t xml:space="preserve">dopisano temat o uwierzytelnianiu przez LDAP, realizujący efekt INF.02.8.3 po stronie serwera Linux;</w:t>
+        <w:t xml:space="preserve">SAMBIE przeznaczono dwie godziny — to najczęstszy punkt styku obu rodzin systemów i typowy element zadania egzaminacyjnego;</w:t>
       </w:r>
     </w:p>
     <w:p>
@@ -331,7 +385,7 @@
           <w:sz w:val="20"/>
           <w:szCs w:val="20"/>
         </w:rPr>
-        <w:t xml:space="preserve">Łączna liczba godzin (60) pozostała bez zmian; tematów jest 52 zamiast 54, bo część jednogodzinnych zajęć połączono w bloki dwugodzinne.</w:t>
+        <w:t xml:space="preserve">Łączna liczba godzin (60) pozostała bez zmian; tematów jest 53 zamiast 54, bo część jednogodzinnych zajęć połączono w bloki dwugodzinne.</w:t>
       </w:r>
     </w:p>
     <w:p>
@@ -7275,7 +7329,7 @@
           <w:sz w:val="21"/>
           <w:szCs w:val="21"/>
         </w:rPr>
-        <w:t xml:space="preserve">Jednostka INF.02.8 „Administrowanie serwerowymi systemami operacyjnymi” — uczeń:</w:t>
+        <w:t xml:space="preserve">Jednostka INF.07.5 „Administrowanie sieciowymi systemami operacyjnymi” — uczeń:</w:t>
       </w:r>
     </w:p>
     <w:p>
@@ -7293,7 +7347,7 @@
           <w:sz w:val="20"/>
           <w:szCs w:val="20"/>
         </w:rPr>
-        <w:t xml:space="preserve">INF.02.8.1 — charakteryzuje i instaluje sieciowe systemy operacyjne z rodziny Windows i Linux (działy I, II, VIII);</w:t>
+        <w:t xml:space="preserve">INF.07.5.1 — charakteryzuje sieciowe systemy operacyjne z rodziny Windows i Linux (działy I, X);</w:t>
       </w:r>
     </w:p>
     <w:p>
@@ -7311,7 +7365,7 @@
           <w:sz w:val="20"/>
           <w:szCs w:val="20"/>
         </w:rPr>
-        <w:t xml:space="preserve">INF.02.8.2 — konfiguruje usługi i funkcje sieciowych systemów operacyjnych z rodziny Windows oraz Linux (działy I, IV, V, VI, VII, VIII);</w:t>
+        <w:t xml:space="preserve">INF.07.5.2 — wdraża sieciowe systemy operacyjne z rodziny Windows i Linux (działy II, III);</w:t>
       </w:r>
     </w:p>
     <w:p>
@@ -7329,7 +7383,7 @@
           <w:sz w:val="20"/>
           <w:szCs w:val="20"/>
         </w:rPr>
-        <w:t xml:space="preserve">INF.02.8.3 — promuje i zarządza kontrolerem domeny (działy II, VIII);</w:t>
+        <w:t xml:space="preserve">INF.07.5.3 — zarządza kontami i grupami użytkowników (działy II, III, VII);</w:t>
       </w:r>
     </w:p>
     <w:p>
@@ -7347,7 +7401,7 @@
           <w:sz w:val="20"/>
           <w:szCs w:val="20"/>
         </w:rPr>
-        <w:t xml:space="preserve">INF.02.8.4 — stosuje protokoły w sieci komputerowej (dział III);</w:t>
+        <w:t xml:space="preserve">INF.07.5.4 — udostępnia zasoby w sieci komputerowej (działy II, V, VI, X);</w:t>
       </w:r>
     </w:p>
     <w:p>
@@ -7365,7 +7419,7 @@
           <w:sz w:val="20"/>
           <w:szCs w:val="20"/>
         </w:rPr>
-        <w:t xml:space="preserve">INF.02.8.5 — udostępnia zasoby w sieci komputerowej (działy II, III, V, VI, VII, VIII, IX);</w:t>
+        <w:t xml:space="preserve">INF.07.5.5 — wdraża role i usługi sieciowe (działy IV, V, VI, VII, X);</w:t>
       </w:r>
     </w:p>
     <w:p>
@@ -7383,7 +7437,43 @@
           <w:sz w:val="20"/>
           <w:szCs w:val="20"/>
         </w:rPr>
-        <w:t xml:space="preserve">INF.02.8.6 — zarządza stacjami roboczymi (działy VII, VIII, IX);</w:t>
+        <w:t xml:space="preserve">INF.07.5.6 — stosuje systemy i oprogramowanie do wirtualizacji (działy I, II, III);</w:t>
+      </w:r>
+    </w:p>
+    <w:p>
+      <w:pPr>
+        <w:pStyle w:val="ListParagraph"/>
+        <w:numPr>
+          <w:ilvl w:val="0"/>
+          <w:numId w:val="2"/>
+        </w:numPr>
+        <w:spacing w:after="40" w:line="252"/>
+      </w:pPr>
+      <w:r>
+        <w:rPr>
+          <w:rFonts w:ascii="Calibri" w:cs="Calibri" w:eastAsia="Calibri" w:hAnsi="Calibri"/>
+          <w:sz w:val="20"/>
+          <w:szCs w:val="20"/>
+        </w:rPr>
+        <w:t xml:space="preserve">INF.07.5.7 — lokalizuje i usuwa awarie sieciowych systemów operacyjnych (działy III, VII, IX);</w:t>
+      </w:r>
+    </w:p>
+    <w:p>
+      <w:pPr>
+        <w:pStyle w:val="ListParagraph"/>
+        <w:numPr>
+          <w:ilvl w:val="0"/>
+          <w:numId w:val="2"/>
+        </w:numPr>
+        <w:spacing w:after="40" w:line="252"/>
+      </w:pPr>
+      <w:r>
+        <w:rPr>
+          <w:rFonts w:ascii="Calibri" w:cs="Calibri" w:eastAsia="Calibri" w:hAnsi="Calibri"/>
+          <w:sz w:val="20"/>
+          <w:szCs w:val="20"/>
+        </w:rPr>
+        <w:t xml:space="preserve">INF.07.5.8 — zabezpiecza systemy przed szkodliwym oprogramowaniem, niekontrolowanym przepływem informacji oraz utratą danych (działy VIII, IX);</w:t>
       </w:r>
     </w:p>
     <w:p>
@@ -7396,7 +7486,7 @@
           <w:sz w:val="21"/>
           <w:szCs w:val="21"/>
         </w:rPr>
-        <w:t xml:space="preserve">Jednostka INF.02.1 „Bezpieczeństwo i higiena pracy” realizowana jest przy temacie pierwszym w zakresie organizacji stanowiska pracy administratora, przepisów bhp i ochrony przeciwpożarowej w pracowni.</w:t>
+        <w:t xml:space="preserve">Jednostka INF.07.1 „Bezpieczeństwo i higiena pracy” realizowana jest przy temacie pierwszym w zakresie organizacji stanowiska pracy administratora, przepisów bhp i ochrony przeciwpożarowej w pracowni.</w:t>
       </w:r>
     </w:p>
     <w:p>
@@ -7412,7 +7502,7 @@
           <w:sz w:val="20"/>
           <w:szCs w:val="20"/>
         </w:rPr>
-        <w:t xml:space="preserve">Uwaga: przedmiot realizuje część efektów jednostki INF.02.8; pełne przygotowanie do części praktycznej egzaminu zawodowego INF.02 wymaga także treści z pozostałych przedmiotów kwalifikacji, w szczególności z lokalnych sieci komputerowych (INF.02.6) oraz urządzeń techniki komputerowej.</w:t>
+        <w:t xml:space="preserve">Uwaga: kwalifikacja INF.07 obejmuje także jednostki INF.07.2 (podstawy teleinformatyki), INF.07.3 (wykonanie lokalnej sieci komputerowej na podstawie projektu) oraz INF.07.4 (instalacja i konfiguracja systemów operacyjnych i urządzeń sieci lokalnych), realizowane na innych przedmiotach. Pełne przygotowanie do części praktycznej egzaminu zawodowego wymaga wszystkich tych treści razem.</w:t>
       </w:r>
     </w:p>
     <w:sectPr>

</xml_diff>